<commit_message>
change: raise maximum transaction amount to 40000.00
- application.yml: transaction.max-amount 10000.00 -> 40000.00
- add a boundary test: an amount exactly on the limit is accepted (35 tests total)
- refresh README, AI_USAGE, TEST_OUTPUT, docs/design.html and DOCUMENTATION.docx
  to the new limit; design.html status codes brought in line with the 400/422 split

Co-Authored-By: Claude Sonnet 5 <noreply@anthropic.com>
</commit_message>
<xml_diff>
--- a/DOCUMENTATION.docx
+++ b/DOCUMENTATION.docx
@@ -34,7 +34,7 @@
           <w:szCs w:val="16"/>
           <w:rFonts w:ascii="Calibri" w:cs="Calibri" w:eastAsia="Calibri" w:hAnsi="Calibri"/>
         </w:rPr>
-        <w:t xml:space="preserve">Toucan Payments Engineering Challenge 2026  ·  Java 17 · Spring Boot · H2 · JUnit  ·  build &amp; test: ./mvnw clean test  ·  34 tests passing</w:t>
+        <w:t xml:space="preserve">Toucan Payments Engineering Challenge 2026  ·  Java 17 · Spring Boot · H2 · JUnit  ·  build &amp; test: ./mvnw clean test  ·  35 tests passing</w:t>
       </w:r>
     </w:p>
     <w:p>
@@ -330,7 +330,7 @@
                 <w:szCs w:val="15"/>
                 <w:rFonts w:ascii="Calibri" w:cs="Calibri" w:eastAsia="Calibri" w:hAnsi="Calibri"/>
               </w:rPr>
-              <w:t xml:space="preserve">10000.00</w:t>
+              <w:t xml:space="preserve">40000.00</w:t>
             </w:r>
           </w:p>
         </w:tc>
@@ -987,7 +987,7 @@
                 <w:szCs w:val="14"/>
                 <w:rFonts w:ascii="Consolas" w:cs="Consolas" w:eastAsia="Consolas" w:hAnsi="Consolas"/>
               </w:rPr>
-              <w:t xml:space="preserve">required; &gt; 0; ≤ 2 decimals (400);  ≤ configured maximum 10000.00 (422)</w:t>
+              <w:t xml:space="preserve">required; &gt; 0; ≤ 2 decimals (400);  ≤ configured maximum 40000.00 (422)</w:t>
             </w:r>
           </w:p>
         </w:tc>
@@ -2073,7 +2073,7 @@
           <w:szCs w:val="17"/>
           <w:rFonts w:ascii="Calibri" w:cs="Calibri" w:eastAsia="Calibri" w:hAnsi="Calibri"/>
         </w:rPr>
-        <w:t xml:space="preserve">Latest clean run: 34 tests, 0 failures / 0 errors (TEST_OUTPUT.txt); also verified from a fresh clone and by hand against a running instance.</w:t>
+        <w:t xml:space="preserve">Latest clean run: 35 tests, 0 failures / 0 errors (TEST_OUTPUT.txt); also verified from a fresh clone and by hand against a running instance.</w:t>
       </w:r>
     </w:p>
     <w:p>

</xml_diff>

<commit_message>
test: restructure into a layered pyramid (layered)
</commit_message>
<xml_diff>
--- a/DOCUMENTATION.docx
+++ b/DOCUMENTATION.docx
@@ -4,7 +4,7 @@
   <w:body>
     <w:p>
       <w:pPr>
-        <w:spacing w:after="30" w:line="224"/>
+        <w:spacing w:after="30" w:line="216"/>
       </w:pPr>
       <w:r>
         <w:rPr>
@@ -23,7 +23,7 @@
         <w:pBdr>
           <w:bottom w:val="single" w:color="1F4E79" w:sz="6" w:space="5"/>
         </w:pBdr>
-        <w:spacing w:after="120" w:line="224"/>
+        <w:spacing w:after="120" w:line="216"/>
       </w:pPr>
       <w:r>
         <w:rPr>
@@ -34,12 +34,12 @@
           <w:szCs w:val="16"/>
           <w:rFonts w:ascii="Calibri" w:cs="Calibri" w:eastAsia="Calibri" w:hAnsi="Calibri"/>
         </w:rPr>
-        <w:t xml:space="preserve">Toucan Payments Engineering Challenge 2026  ·  Java 17 · Spring Boot · H2 · JUnit  ·  build &amp; test: ./mvnw clean test  ·  35 tests passing</w:t>
-      </w:r>
-    </w:p>
-    <w:p>
-      <w:pPr>
-        <w:spacing w:before="92" w:after="40" w:line="224"/>
+        <w:t xml:space="preserve">Toucan Payments Engineering Challenge 2026  ·  Java 17 · Spring Boot · H2 · JUnit  ·  build &amp; test: ./mvnw clean test  ·  73 tests passing</w:t>
+      </w:r>
+    </w:p>
+    <w:p>
+      <w:pPr>
+        <w:spacing w:before="92" w:after="40" w:line="216"/>
       </w:pPr>
       <w:r>
         <w:rPr>
@@ -55,7 +55,7 @@
     </w:p>
     <w:p>
       <w:pPr>
-        <w:spacing w:after="60" w:line="224" w:before="0"/>
+        <w:spacing w:after="60" w:line="216" w:before="0"/>
       </w:pPr>
       <w:r>
         <w:rPr>
@@ -68,7 +68,7 @@
     </w:p>
     <w:p>
       <w:pPr>
-        <w:spacing w:before="92" w:after="40" w:line="224"/>
+        <w:spacing w:before="92" w:after="40" w:line="216"/>
       </w:pPr>
       <w:r>
         <w:rPr>
@@ -84,7 +84,7 @@
     </w:p>
     <w:p>
       <w:pPr>
-        <w:spacing w:after="60" w:line="224" w:before="0"/>
+        <w:spacing w:after="60" w:line="216" w:before="0"/>
       </w:pPr>
       <w:r>
         <w:rPr>
@@ -449,7 +449,7 @@
           <w:ilvl w:val="0"/>
           <w:numId w:val="1"/>
         </w:numPr>
-        <w:spacing w:after="40" w:line="224"/>
+        <w:spacing w:after="40" w:line="216"/>
       </w:pPr>
       <w:r>
         <w:rPr>
@@ -485,7 +485,7 @@
           <w:ilvl w:val="0"/>
           <w:numId w:val="1"/>
         </w:numPr>
-        <w:spacing w:after="40" w:line="224"/>
+        <w:spacing w:after="40" w:line="216"/>
       </w:pPr>
       <w:r>
         <w:rPr>
@@ -551,7 +551,7 @@
           <w:ilvl w:val="0"/>
           <w:numId w:val="1"/>
         </w:numPr>
-        <w:spacing w:after="40" w:line="224"/>
+        <w:spacing w:after="40" w:line="216"/>
       </w:pPr>
       <w:r>
         <w:rPr>
@@ -564,7 +564,7 @@
     </w:p>
     <w:p>
       <w:pPr>
-        <w:spacing w:before="92" w:after="40" w:line="224"/>
+        <w:spacing w:before="92" w:after="40" w:line="216"/>
       </w:pPr>
       <w:r>
         <w:rPr>
@@ -580,7 +580,7 @@
     </w:p>
     <w:p>
       <w:pPr>
-        <w:spacing w:after="60" w:line="224" w:before="0"/>
+        <w:spacing w:after="60" w:line="216" w:before="0"/>
       </w:pPr>
       <w:r>
         <w:rPr>
@@ -1471,7 +1471,7 @@
     </w:tbl>
     <w:p>
       <w:pPr>
-        <w:spacing w:after="60" w:line="224" w:before="40"/>
+        <w:spacing w:after="60" w:line="216" w:before="40"/>
       </w:pPr>
       <w:r>
         <w:rPr>
@@ -1494,7 +1494,7 @@
     </w:p>
     <w:p>
       <w:pPr>
-        <w:spacing w:after="60" w:line="224" w:before="0"/>
+        <w:spacing w:after="60" w:line="216" w:before="0"/>
       </w:pPr>
       <w:r>
         <w:rPr>
@@ -1507,7 +1507,7 @@
     </w:p>
     <w:p>
       <w:pPr>
-        <w:spacing w:before="92" w:after="40" w:line="224"/>
+        <w:spacing w:before="92" w:after="40" w:line="216"/>
       </w:pPr>
       <w:r>
         <w:rPr>
@@ -1523,7 +1523,7 @@
     </w:p>
     <w:p>
       <w:pPr>
-        <w:spacing w:after="60" w:line="224" w:before="0"/>
+        <w:spacing w:after="60" w:line="216" w:before="0"/>
       </w:pPr>
       <w:r>
         <w:rPr>
@@ -1963,7 +1963,7 @@
     </w:tbl>
     <w:p>
       <w:pPr>
-        <w:spacing w:after="60" w:line="224" w:before="40"/>
+        <w:spacing w:after="60" w:line="216" w:before="40"/>
       </w:pPr>
       <w:r>
         <w:rPr>
@@ -1986,7 +1986,7 @@
     </w:p>
     <w:p>
       <w:pPr>
-        <w:spacing w:before="92" w:after="40" w:line="224"/>
+        <w:spacing w:before="92" w:after="40" w:line="216"/>
       </w:pPr>
       <w:r>
         <w:rPr>
@@ -2002,12 +2002,25 @@
     </w:p>
     <w:p>
       <w:pPr>
+        <w:spacing w:after="60" w:line="216" w:before="0"/>
+      </w:pPr>
+      <w:r>
+        <w:rPr>
+          <w:sz w:val="17"/>
+          <w:szCs w:val="17"/>
+          <w:rFonts w:ascii="Calibri" w:cs="Calibri" w:eastAsia="Calibri" w:hAnsi="Calibri"/>
+        </w:rPr>
+        <w:t xml:space="preserve">Each rule is tested at the lowest layer it lives in; the integration test only proves the layers are wired together. 73 tests in five classes:</w:t>
+      </w:r>
+    </w:p>
+    <w:p>
+      <w:pPr>
         <w:pStyle w:val="ListParagraph"/>
         <w:numPr>
           <w:ilvl w:val="0"/>
           <w:numId w:val="1"/>
         </w:numPr>
-        <w:spacing w:after="40" w:line="224"/>
+        <w:spacing w:after="40" w:line="216"/>
       </w:pPr>
       <w:r>
         <w:rPr>
@@ -2025,7 +2038,7 @@
           <w:szCs w:val="17"/>
           <w:rFonts w:ascii="Calibri" w:cs="Calibri" w:eastAsia="Calibri" w:hAnsi="Calibri"/>
         </w:rPr>
-        <w:t xml:space="preserve"> — parameterised unit tests for the transition rules (allowed pairs, forbidden pairs, self-transitions, terminal states); no Spring context.</w:t>
+        <w:t xml:space="preserve"> (17) — transition rules alone, parameterised. No Spring.</w:t>
       </w:r>
     </w:p>
     <w:p>
@@ -2035,7 +2048,7 @@
           <w:ilvl w:val="0"/>
           <w:numId w:val="1"/>
         </w:numPr>
-        <w:spacing w:after="40" w:line="224"/>
+        <w:spacing w:after="40" w:line="216"/>
       </w:pPr>
       <w:r>
         <w:rPr>
@@ -2045,15 +2058,15 @@
           <w:szCs w:val="17"/>
           <w:rFonts w:ascii="Calibri" w:cs="Calibri" w:eastAsia="Calibri" w:hAnsi="Calibri"/>
         </w:rPr>
-        <w:t xml:space="preserve">TransactionApiTest</w:t>
-      </w:r>
-      <w:r>
-        <w:rPr>
-          <w:sz w:val="17"/>
-          <w:szCs w:val="17"/>
-          <w:rFonts w:ascii="Calibri" w:cs="Calibri" w:eastAsia="Calibri" w:hAnsi="Calibri"/>
-        </w:rPr>
-        <w:t xml:space="preserve"> — @SpringBootTest + MockMvc over real HTTP against H2. Covers the four named cases (created OK, validation rejection, duplicate ID, unknown ID) plus unsupported currency, over-limit amount, unknown type, get existing, both status-update outcomes, unknown-ID update, per-customer filtering, empty list, missing parameter. Provided contextLoads kept. Each test clears the table first, so order does not matter.</w:t>
+        <w:t xml:space="preserve">CreateTransactionRequestValidationTest</w:t>
+      </w:r>
+      <w:r>
+        <w:rPr>
+          <w:sz w:val="17"/>
+          <w:szCs w:val="17"/>
+          <w:rFonts w:ascii="Calibri" w:cs="Calibri" w:eastAsia="Calibri" w:hAnsi="Calibri"/>
+        </w:rPr>
+        <w:t xml:space="preserve"> (18) — the DTO annotations alone via a raw Validator, one test per constraint. No Spring.</w:t>
       </w:r>
     </w:p>
     <w:p>
@@ -2063,7 +2076,7 @@
           <w:ilvl w:val="0"/>
           <w:numId w:val="1"/>
         </w:numPr>
-        <w:spacing w:after="40" w:line="224"/>
+        <w:spacing w:after="40" w:line="216"/>
       </w:pPr>
       <w:r>
         <w:rPr>
@@ -2073,12 +2086,96 @@
           <w:szCs w:val="17"/>
           <w:rFonts w:ascii="Calibri" w:cs="Calibri" w:eastAsia="Calibri" w:hAnsi="Calibri"/>
         </w:rPr>
-        <w:t xml:space="preserve">Latest clean run: 35 tests, 0 failures / 0 errors (TEST_OUTPUT.txt); also verified from a fresh clone and by hand against a running instance.</w:t>
-      </w:r>
-    </w:p>
-    <w:p>
-      <w:pPr>
-        <w:spacing w:before="92" w:after="40" w:line="224"/>
+        <w:t xml:space="preserve">TransactionServiceTest</w:t>
+      </w:r>
+      <w:r>
+        <w:rPr>
+          <w:sz w:val="17"/>
+          <w:szCs w:val="17"/>
+          <w:rFonts w:ascii="Calibri" w:cs="Calibri" w:eastAsia="Calibri" w:hAnsi="Calibri"/>
+        </w:rPr>
+        <w:t xml:space="preserve"> (15) — business rules alone, mocked repository + fixed Clock: currency whitelist, amount cap and boundary, scale normalisation, timestamps, duplicate rejected before any write, a DB unique-violation turned into a clean 409, every status-update outcome. verify(never().save()) on each rejection.</w:t>
+      </w:r>
+    </w:p>
+    <w:p>
+      <w:pPr>
+        <w:pStyle w:val="ListParagraph"/>
+        <w:numPr>
+          <w:ilvl w:val="0"/>
+          <w:numId w:val="1"/>
+        </w:numPr>
+        <w:spacing w:after="40" w:line="216"/>
+      </w:pPr>
+      <w:r>
+        <w:rPr>
+          <w:b/>
+          <w:bCs/>
+          <w:sz w:val="17"/>
+          <w:szCs w:val="17"/>
+          <w:rFonts w:ascii="Calibri" w:cs="Calibri" w:eastAsia="Calibri" w:hAnsi="Calibri"/>
+        </w:rPr>
+        <w:t xml:space="preserve">TransactionControllerTest</w:t>
+      </w:r>
+      <w:r>
+        <w:rPr>
+          <w:sz w:val="17"/>
+          <w:szCs w:val="17"/>
+          <w:rFonts w:ascii="Calibri" w:cs="Calibri" w:eastAsia="Calibri" w:hAnsi="Calibri"/>
+        </w:rPr>
+        <w:t xml:space="preserve"> (14) — web layer alone, @WebMvcTest + mocked service: status/exception mapping (201 + Location, 400 / 422 / 409 / 404), a malformed body never reaching the service, a malformed id in the URL as a 400 not a 500.</w:t>
+      </w:r>
+    </w:p>
+    <w:p>
+      <w:pPr>
+        <w:pStyle w:val="ListParagraph"/>
+        <w:numPr>
+          <w:ilvl w:val="0"/>
+          <w:numId w:val="1"/>
+        </w:numPr>
+        <w:spacing w:after="40" w:line="216"/>
+      </w:pPr>
+      <w:r>
+        <w:rPr>
+          <w:b/>
+          <w:bCs/>
+          <w:sz w:val="17"/>
+          <w:szCs w:val="17"/>
+          <w:rFonts w:ascii="Calibri" w:cs="Calibri" w:eastAsia="Calibri" w:hAnsi="Calibri"/>
+        </w:rPr>
+        <w:t xml:space="preserve">TransactionApiTest</w:t>
+      </w:r>
+      <w:r>
+        <w:rPr>
+          <w:sz w:val="17"/>
+          <w:szCs w:val="17"/>
+          <w:rFonts w:ascii="Calibri" w:cs="Calibri" w:eastAsia="Calibri" w:hAnsi="Calibri"/>
+        </w:rPr>
+        <w:t xml:space="preserve"> (8) — whole stack, @SpringBootTest + real H2, @Transactional: the four named scenarios, the full lifecycle, and that data persists between requests.</w:t>
+      </w:r>
+    </w:p>
+    <w:p>
+      <w:pPr>
+        <w:pStyle w:val="ListParagraph"/>
+        <w:numPr>
+          <w:ilvl w:val="0"/>
+          <w:numId w:val="1"/>
+        </w:numPr>
+        <w:spacing w:after="40" w:line="216"/>
+      </w:pPr>
+      <w:r>
+        <w:rPr>
+          <w:b/>
+          <w:bCs/>
+          <w:sz w:val="17"/>
+          <w:szCs w:val="17"/>
+          <w:rFonts w:ascii="Calibri" w:cs="Calibri" w:eastAsia="Calibri" w:hAnsi="Calibri"/>
+        </w:rPr>
+        <w:t xml:space="preserve">Latest clean run: 73 tests, 0 failures / 0 errors (TEST_OUTPUT.txt); also verified from a fresh clone.</w:t>
+      </w:r>
+    </w:p>
+    <w:p>
+      <w:pPr>
+        <w:spacing w:before="92" w:after="40" w:line="216"/>
       </w:pPr>
       <w:r>
         <w:rPr>
@@ -2099,7 +2196,7 @@
           <w:ilvl w:val="0"/>
           <w:numId w:val="1"/>
         </w:numPr>
-        <w:spacing w:after="40" w:line="224"/>
+        <w:spacing w:after="40" w:line="216"/>
       </w:pPr>
       <w:r>
         <w:rPr>
@@ -2117,7 +2214,7 @@
           <w:ilvl w:val="0"/>
           <w:numId w:val="1"/>
         </w:numPr>
-        <w:spacing w:after="40" w:line="224"/>
+        <w:spacing w:after="40" w:line="216"/>
       </w:pPr>
       <w:r>
         <w:rPr>
@@ -2135,20 +2232,20 @@
           <w:ilvl w:val="0"/>
           <w:numId w:val="1"/>
         </w:numPr>
-        <w:spacing w:after="40" w:line="224"/>
-      </w:pPr>
-      <w:r>
-        <w:rPr>
-          <w:sz w:val="17"/>
-          <w:szCs w:val="17"/>
-          <w:rFonts w:ascii="Calibri" w:cs="Calibri" w:eastAsia="Calibri" w:hAnsi="Calibri"/>
-        </w:rPr>
-        <w:t xml:space="preserve">The assigned variant was not applied (see Assumptions). Clock is injectable but time is not asserted precisely in the integration tests.</w:t>
-      </w:r>
-    </w:p>
-    <w:p>
-      <w:pPr>
-        <w:spacing w:before="92" w:after="40" w:line="224"/>
+        <w:spacing w:after="40" w:line="216"/>
+      </w:pPr>
+      <w:r>
+        <w:rPr>
+          <w:sz w:val="17"/>
+          <w:szCs w:val="17"/>
+          <w:rFonts w:ascii="Calibri" w:cs="Calibri" w:eastAsia="Calibri" w:hAnsi="Calibri"/>
+        </w:rPr>
+        <w:t xml:space="preserve">The assigned variant was not applied (see Assumptions). Currency is shape-checked against the permitted set, not a full ISO-4217 register.</w:t>
+      </w:r>
+    </w:p>
+    <w:p>
+      <w:pPr>
+        <w:spacing w:before="92" w:after="40" w:line="216"/>
       </w:pPr>
       <w:r>
         <w:rPr>
@@ -2169,15 +2266,15 @@
           <w:ilvl w:val="0"/>
           <w:numId w:val="1"/>
         </w:numPr>
-        <w:spacing w:after="40" w:line="224"/>
-      </w:pPr>
-      <w:r>
-        <w:rPr>
-          <w:sz w:val="17"/>
-          <w:szCs w:val="17"/>
-          <w:rFonts w:ascii="Calibri" w:cs="Calibri" w:eastAsia="Calibri" w:hAnsi="Calibri"/>
-        </w:rPr>
-        <w:t xml:space="preserve">Apply the real assigned variant; add per-field detail to the 422 business-rule errors (currency, amount) so the body points at the offending field.</w:t>
+        <w:spacing w:after="40" w:line="216"/>
+      </w:pPr>
+      <w:r>
+        <w:rPr>
+          <w:sz w:val="17"/>
+          <w:szCs w:val="17"/>
+          <w:rFonts w:ascii="Calibri" w:cs="Calibri" w:eastAsia="Calibri" w:hAnsi="Calibri"/>
+        </w:rPr>
+        <w:t xml:space="preserve">Apply the real assigned variant; add per-field detail to the 422 business-rule errors so the body points at the offending field.</w:t>
       </w:r>
     </w:p>
     <w:p>
@@ -2187,25 +2284,7 @@
           <w:ilvl w:val="0"/>
           <w:numId w:val="1"/>
         </w:numPr>
-        <w:spacing w:after="40" w:line="224"/>
-      </w:pPr>
-      <w:r>
-        <w:rPr>
-          <w:sz w:val="17"/>
-          <w:szCs w:val="17"/>
-          <w:rFonts w:ascii="Calibri" w:cs="Calibri" w:eastAsia="Calibri" w:hAnsi="Calibri"/>
-        </w:rPr>
-        <w:t xml:space="preserve">A TransactionService unit test with a mocked repository and a fixed Clock, separate from the HTTP tests.</w:t>
-      </w:r>
-    </w:p>
-    <w:p>
-      <w:pPr>
-        <w:pStyle w:val="ListParagraph"/>
-        <w:numPr>
-          <w:ilvl w:val="0"/>
-          <w:numId w:val="1"/>
-        </w:numPr>
-        <w:spacing w:after="40" w:line="224"/>
+        <w:spacing w:after="40" w:line="216"/>
       </w:pPr>
       <w:r>
         <w:rPr>
@@ -2374,7 +2453,7 @@
     </w:rPrDefault>
     <w:pPrDefault>
       <w:pPr>
-        <w:spacing w:line="224"/>
+        <w:spacing w:line="216"/>
       </w:pPr>
     </w:pPrDefault>
   </w:docDefaults>

</xml_diff>